<commit_message>
Adding text parsing and cleaning scripts and  tests
</commit_message>
<xml_diff>
--- a/data/resumes/Resume_09.docx
+++ b/data/resumes/Resume_09.docx
@@ -1,6 +1,6 @@
 
 <file path=word/document.xml><?xml version="1.0" encoding="utf-8"?>
-<w:document xmlns:wpc="http://schemas.microsoft.com/office/word/2010/wordprocessingCanvas" xmlns:cx="http://schemas.microsoft.com/office/drawing/2014/chartex" xmlns:cx1="http://schemas.microsoft.com/office/drawing/2015/9/8/chartex" xmlns:mc="http://schemas.openxmlformats.org/markup-compatibility/2006" xmlns:o="urn:schemas-microsoft-com:office:office" xmlns:r="http://schemas.openxmlformats.org/officeDocument/2006/relationships" xmlns:m="http://schemas.openxmlformats.org/officeDocument/2006/math" xmlns:v="urn:schemas-microsoft-com:vml" xmlns:wp14="http://schemas.microsoft.com/office/word/2010/wordprocessingDrawing" xmlns:wp="http://schemas.openxmlformats.org/drawingml/2006/wordprocessingDrawing" xmlns:w10="urn:schemas-microsoft-com:office:word" xmlns:w="http://schemas.openxmlformats.org/wordprocessingml/2006/main" xmlns:w14="http://schemas.microsoft.com/office/word/2010/wordml" xmlns:w15="http://schemas.microsoft.com/office/word/2012/wordml" xmlns:w16se="http://schemas.microsoft.com/office/word/2015/wordml/symex" xmlns:wpg="http://schemas.microsoft.com/office/word/2010/wordprocessingGroup" xmlns:wpi="http://schemas.microsoft.com/office/word/2010/wordprocessingInk" xmlns:wne="http://schemas.microsoft.com/office/word/2006/wordml" xmlns:wps="http://schemas.microsoft.com/office/word/2010/wordprocessingShape" mc:Ignorable="w14 w15 w16se wp14">
+<w:document xmlns:wpc="http://schemas.microsoft.com/office/word/2010/wordprocessingCanvas" xmlns:cx="http://schemas.microsoft.com/office/drawing/2014/chartex" xmlns:cx1="http://schemas.microsoft.com/office/drawing/2015/9/8/chartex" xmlns:cx2="http://schemas.microsoft.com/office/drawing/2015/10/21/chartex" xmlns:cx3="http://schemas.microsoft.com/office/drawing/2016/5/9/chartex" xmlns:cx4="http://schemas.microsoft.com/office/drawing/2016/5/10/chartex" xmlns:cx5="http://schemas.microsoft.com/office/drawing/2016/5/11/chartex" xmlns:cx6="http://schemas.microsoft.com/office/drawing/2016/5/12/chartex" xmlns:cx7="http://schemas.microsoft.com/office/drawing/2016/5/13/chartex" xmlns:cx8="http://schemas.microsoft.com/office/drawing/2016/5/14/chartex" xmlns:mc="http://schemas.openxmlformats.org/markup-compatibility/2006" xmlns:aink="http://schemas.microsoft.com/office/drawing/2016/ink" xmlns:am3d="http://schemas.microsoft.com/office/drawing/2017/model3d" xmlns:o="urn:schemas-microsoft-com:office:office" xmlns:r="http://schemas.openxmlformats.org/officeDocument/2006/relationships" xmlns:m="http://schemas.openxmlformats.org/officeDocument/2006/math" xmlns:v="urn:schemas-microsoft-com:vml" xmlns:wp14="http://schemas.microsoft.com/office/word/2010/wordprocessingDrawing" xmlns:wp="http://schemas.openxmlformats.org/drawingml/2006/wordprocessingDrawing" xmlns:w10="urn:schemas-microsoft-com:office:word" xmlns:w="http://schemas.openxmlformats.org/wordprocessingml/2006/main" xmlns:w14="http://schemas.microsoft.com/office/word/2010/wordml" xmlns:w15="http://schemas.microsoft.com/office/word/2012/wordml" xmlns:w16cex="http://schemas.microsoft.com/office/word/2018/wordml/cex" xmlns:w16cid="http://schemas.microsoft.com/office/word/2016/wordml/cid" xmlns:w16="http://schemas.microsoft.com/office/word/2018/wordml" xmlns:w16sdtdh="http://schemas.microsoft.com/office/word/2020/wordml/sdtdatahash" xmlns:w16se="http://schemas.microsoft.com/office/word/2015/wordml/symex" xmlns:wpg="http://schemas.microsoft.com/office/word/2010/wordprocessingGroup" xmlns:wpi="http://schemas.microsoft.com/office/word/2010/wordprocessingInk" xmlns:wne="http://schemas.microsoft.com/office/word/2006/wordml" xmlns:wps="http://schemas.microsoft.com/office/word/2010/wordprocessingShape" mc:Ignorable="w14 w15 w16se w16cid w16 w16cex w16sdtdh wp14">
   <w:body>
     <w:tbl>
       <w:tblPr>
@@ -23,12 +23,6 @@
         <w:gridCol w:w="9360"/>
       </w:tblGrid>
       <w:tr>
-        <w:tblPrEx>
-          <w:tblCellMar>
-            <w:top w:w="0" w:type="dxa"/>
-            <w:bottom w:w="0" w:type="dxa"/>
-          </w:tblCellMar>
-        </w:tblPrEx>
         <w:tc>
           <w:tcPr>
             <w:tcW w:w="9360" w:type="dxa"/>
@@ -82,8 +76,6 @@
               </w:rPr>
               <w:t>(CGPA 3.36)</w:t>
             </w:r>
-            <w:bookmarkStart w:id="0" w:name="_GoBack"/>
-            <w:bookmarkEnd w:id="0"/>
             <w:r>
               <w:rPr>
                 <w:rFonts w:ascii="Calibri" w:eastAsia="Calibri" w:hAnsi="Calibri" w:cs="Calibri"/>
@@ -91,7 +83,25 @@
                 <w:sz w:val="22"/>
                 <w:szCs w:val="22"/>
               </w:rPr>
-              <w:t xml:space="preserve"> ·  CUST</w:t>
+              <w:t xml:space="preserve"> ·  </w:t>
+            </w:r>
+            <w:r>
+              <w:rPr>
+                <w:rFonts w:ascii="Calibri" w:eastAsia="Calibri" w:hAnsi="Calibri" w:cs="Calibri"/>
+                <w:color w:val="D0EFEF"/>
+                <w:sz w:val="22"/>
+                <w:szCs w:val="22"/>
+              </w:rPr>
+              <w:t>N</w:t>
+            </w:r>
+            <w:r>
+              <w:rPr>
+                <w:rFonts w:ascii="Calibri" w:eastAsia="Calibri" w:hAnsi="Calibri" w:cs="Calibri"/>
+                <w:color w:val="D0EFEF"/>
+                <w:sz w:val="22"/>
+                <w:szCs w:val="22"/>
+              </w:rPr>
+              <w:t>UST</w:t>
             </w:r>
           </w:p>
         </w:tc>
@@ -125,12 +135,6 @@
         <w:gridCol w:w="6227"/>
       </w:tblGrid>
       <w:tr>
-        <w:tblPrEx>
-          <w:tblCellMar>
-            <w:top w:w="0" w:type="dxa"/>
-            <w:bottom w:w="0" w:type="dxa"/>
-          </w:tblCellMar>
-        </w:tblPrEx>
         <w:tc>
           <w:tcPr>
             <w:tcW w:w="2760" w:type="dxa"/>
@@ -176,7 +180,7 @@
                 <w:sz w:val="19"/>
                 <w:szCs w:val="19"/>
               </w:rPr>
-              <w:t>📞</w:t>
+              <w:t>📞  0327</w:t>
             </w:r>
             <w:r>
               <w:rPr>
@@ -185,7 +189,7 @@
                 <w:sz w:val="19"/>
                 <w:szCs w:val="19"/>
               </w:rPr>
-              <w:t xml:space="preserve">  03278326641</w:t>
+              <w:t>1234567</w:t>
             </w:r>
           </w:p>
           <w:p>
@@ -199,7 +203,7 @@
                 <w:sz w:val="19"/>
                 <w:szCs w:val="19"/>
               </w:rPr>
-              <w:t>📧</w:t>
+              <w:t>📧  seharmujtaba</w:t>
             </w:r>
             <w:r>
               <w:rPr>
@@ -208,7 +212,16 @@
                 <w:sz w:val="19"/>
                 <w:szCs w:val="19"/>
               </w:rPr>
-              <w:t xml:space="preserve">  seharmujtaba2023@gmail.com</w:t>
+              <w:t>0012</w:t>
+            </w:r>
+            <w:r>
+              <w:rPr>
+                <w:rFonts w:ascii="Calibri" w:eastAsia="Calibri" w:hAnsi="Calibri" w:cs="Calibri"/>
+                <w:color w:val="FFFFFF"/>
+                <w:sz w:val="19"/>
+                <w:szCs w:val="19"/>
+              </w:rPr>
+              <w:t>@gmail.com</w:t>
             </w:r>
           </w:p>
           <w:p>
@@ -221,15 +234,7 @@
                 <w:sz w:val="19"/>
                 <w:szCs w:val="19"/>
               </w:rPr>
-              <w:t>🔗</w:t>
-            </w:r>
-            <w:r>
-              <w:rPr>
-                <w:rFonts w:ascii="Segoe UI Emoji" w:eastAsia="Segoe UI Emoji" w:hAnsi="Segoe UI Emoji" w:cs="Segoe UI Emoji"/>
-                <w:sz w:val="19"/>
-                <w:szCs w:val="19"/>
-              </w:rPr>
-              <w:t xml:space="preserve">  </w:t>
+              <w:t xml:space="preserve">🔗  </w:t>
             </w:r>
             <w:hyperlink r:id="rId5" w:history="1">
               <w:r>
@@ -240,20 +245,8 @@
                   <w:szCs w:val="19"/>
                   <w:u w:val="single"/>
                 </w:rPr>
-                <w:t>github.com/</w:t>
+                <w:t>github.com/SeharMujtaba</w:t>
               </w:r>
-              <w:proofErr w:type="spellStart"/>
-              <w:r>
-                <w:rPr>
-                  <w:rFonts w:ascii="Calibri" w:eastAsia="Calibri" w:hAnsi="Calibri" w:cs="Calibri"/>
-                  <w:color w:val="A8E6E6"/>
-                  <w:sz w:val="19"/>
-                  <w:szCs w:val="19"/>
-                  <w:u w:val="single"/>
-                </w:rPr>
-                <w:t>SeharMujtaba</w:t>
-              </w:r>
-              <w:proofErr w:type="spellEnd"/>
             </w:hyperlink>
           </w:p>
           <w:p>
@@ -334,8 +327,13 @@
                 <w:sz w:val="18"/>
                 <w:szCs w:val="18"/>
               </w:rPr>
-              <w:t>📅</w:t>
-            </w:r>
+              <w:t>📅  6th Semester</w:t>
+            </w:r>
+          </w:p>
+          <w:p>
+            <w:pPr>
+              <w:spacing w:before="40" w:after="180"/>
+            </w:pPr>
             <w:r>
               <w:rPr>
                 <w:rFonts w:ascii="Calibri" w:eastAsia="Calibri" w:hAnsi="Calibri" w:cs="Calibri"/>
@@ -343,30 +341,7 @@
                 <w:sz w:val="18"/>
                 <w:szCs w:val="18"/>
               </w:rPr>
-              <w:t xml:space="preserve">  6th Semester</w:t>
-            </w:r>
-          </w:p>
-          <w:p>
-            <w:pPr>
-              <w:spacing w:before="40" w:after="180"/>
-            </w:pPr>
-            <w:r>
-              <w:rPr>
-                <w:rFonts w:ascii="Calibri" w:eastAsia="Calibri" w:hAnsi="Calibri" w:cs="Calibri"/>
-                <w:color w:val="A8D8D8"/>
-                <w:sz w:val="18"/>
-                <w:szCs w:val="18"/>
-              </w:rPr>
-              <w:t>🎓</w:t>
-            </w:r>
-            <w:r>
-              <w:rPr>
-                <w:rFonts w:ascii="Calibri" w:eastAsia="Calibri" w:hAnsi="Calibri" w:cs="Calibri"/>
-                <w:color w:val="A8D8D8"/>
-                <w:sz w:val="18"/>
-                <w:szCs w:val="18"/>
-              </w:rPr>
-              <w:t xml:space="preserve">  Expected: 2027</w:t>
+              <w:t>🎓  Expected: 2027</w:t>
             </w:r>
           </w:p>
           <w:p>
@@ -404,23 +379,51 @@
                 <w:sz w:val="19"/>
                 <w:szCs w:val="19"/>
               </w:rPr>
-              <w:t>⚙</w:t>
-            </w:r>
+              <w:t xml:space="preserve">⚙️  </w:t>
+            </w:r>
+            <w:r>
+              <w:rPr>
+                <w:rFonts w:ascii="Calibri" w:eastAsia="Calibri" w:hAnsi="Calibri" w:cs="Calibri"/>
+                <w:color w:val="FFFFFF"/>
+                <w:sz w:val="19"/>
+                <w:szCs w:val="19"/>
+              </w:rPr>
+              <w:t>VS Code</w:t>
+            </w:r>
+          </w:p>
+          <w:p>
+            <w:pPr>
+              <w:spacing w:before="70" w:after="70"/>
+            </w:pPr>
             <w:r>
               <w:rPr>
                 <w:rFonts w:ascii="Segoe UI Emoji" w:eastAsia="Segoe UI Emoji" w:hAnsi="Segoe UI Emoji" w:cs="Segoe UI Emoji"/>
                 <w:sz w:val="19"/>
                 <w:szCs w:val="19"/>
               </w:rPr>
-              <w:t>️</w:t>
-            </w:r>
+              <w:t xml:space="preserve">🎮  </w:t>
+            </w:r>
+            <w:r>
+              <w:rPr>
+                <w:rFonts w:ascii="Calibri" w:eastAsia="Calibri" w:hAnsi="Calibri" w:cs="Calibri"/>
+                <w:color w:val="FFFFFF"/>
+                <w:sz w:val="19"/>
+                <w:szCs w:val="19"/>
+              </w:rPr>
+              <w:t>Unity Hub</w:t>
+            </w:r>
+          </w:p>
+          <w:p>
+            <w:pPr>
+              <w:spacing w:before="70" w:after="70"/>
+            </w:pPr>
             <w:r>
               <w:rPr>
                 <w:rFonts w:ascii="Segoe UI Emoji" w:eastAsia="Segoe UI Emoji" w:hAnsi="Segoe UI Emoji" w:cs="Segoe UI Emoji"/>
                 <w:sz w:val="19"/>
                 <w:szCs w:val="19"/>
               </w:rPr>
-              <w:t xml:space="preserve">  </w:t>
+              <w:t xml:space="preserve">📋  </w:t>
             </w:r>
             <w:r>
               <w:rPr>
@@ -429,7 +432,7 @@
                 <w:sz w:val="19"/>
                 <w:szCs w:val="19"/>
               </w:rPr>
-              <w:t>VS Code</w:t>
+              <w:t>Jira (Project Mgmt)</w:t>
             </w:r>
           </w:p>
           <w:p>
@@ -442,125 +445,29 @@
                 <w:sz w:val="19"/>
                 <w:szCs w:val="19"/>
               </w:rPr>
-              <w:t>🎮</w:t>
-            </w:r>
+              <w:t xml:space="preserve">🐧  </w:t>
+            </w:r>
+            <w:r>
+              <w:rPr>
+                <w:rFonts w:ascii="Calibri" w:eastAsia="Calibri" w:hAnsi="Calibri" w:cs="Calibri"/>
+                <w:color w:val="FFFFFF"/>
+                <w:sz w:val="19"/>
+                <w:szCs w:val="19"/>
+              </w:rPr>
+              <w:t>Kali Linux</w:t>
+            </w:r>
+          </w:p>
+          <w:p>
+            <w:pPr>
+              <w:spacing w:before="70" w:after="70"/>
+            </w:pPr>
             <w:r>
               <w:rPr>
                 <w:rFonts w:ascii="Segoe UI Emoji" w:eastAsia="Segoe UI Emoji" w:hAnsi="Segoe UI Emoji" w:cs="Segoe UI Emoji"/>
                 <w:sz w:val="19"/>
                 <w:szCs w:val="19"/>
               </w:rPr>
-              <w:t xml:space="preserve">  </w:t>
-            </w:r>
-            <w:r>
-              <w:rPr>
-                <w:rFonts w:ascii="Calibri" w:eastAsia="Calibri" w:hAnsi="Calibri" w:cs="Calibri"/>
-                <w:color w:val="FFFFFF"/>
-                <w:sz w:val="19"/>
-                <w:szCs w:val="19"/>
-              </w:rPr>
-              <w:t>Unity Hub</w:t>
-            </w:r>
-          </w:p>
-          <w:p>
-            <w:pPr>
-              <w:spacing w:before="70" w:after="70"/>
-            </w:pPr>
-            <w:r>
-              <w:rPr>
-                <w:rFonts w:ascii="Segoe UI Emoji" w:eastAsia="Segoe UI Emoji" w:hAnsi="Segoe UI Emoji" w:cs="Segoe UI Emoji"/>
-                <w:sz w:val="19"/>
-                <w:szCs w:val="19"/>
-              </w:rPr>
-              <w:t>📋</w:t>
-            </w:r>
-            <w:r>
-              <w:rPr>
-                <w:rFonts w:ascii="Segoe UI Emoji" w:eastAsia="Segoe UI Emoji" w:hAnsi="Segoe UI Emoji" w:cs="Segoe UI Emoji"/>
-                <w:sz w:val="19"/>
-                <w:szCs w:val="19"/>
-              </w:rPr>
-              <w:t xml:space="preserve">  </w:t>
-            </w:r>
-            <w:r>
-              <w:rPr>
-                <w:rFonts w:ascii="Calibri" w:eastAsia="Calibri" w:hAnsi="Calibri" w:cs="Calibri"/>
-                <w:color w:val="FFFFFF"/>
-                <w:sz w:val="19"/>
-                <w:szCs w:val="19"/>
-              </w:rPr>
-              <w:t xml:space="preserve">Jira (Project </w:t>
-            </w:r>
-            <w:proofErr w:type="spellStart"/>
-            <w:r>
-              <w:rPr>
-                <w:rFonts w:ascii="Calibri" w:eastAsia="Calibri" w:hAnsi="Calibri" w:cs="Calibri"/>
-                <w:color w:val="FFFFFF"/>
-                <w:sz w:val="19"/>
-                <w:szCs w:val="19"/>
-              </w:rPr>
-              <w:t>Mgmt</w:t>
-            </w:r>
-            <w:proofErr w:type="spellEnd"/>
-            <w:r>
-              <w:rPr>
-                <w:rFonts w:ascii="Calibri" w:eastAsia="Calibri" w:hAnsi="Calibri" w:cs="Calibri"/>
-                <w:color w:val="FFFFFF"/>
-                <w:sz w:val="19"/>
-                <w:szCs w:val="19"/>
-              </w:rPr>
-              <w:t>)</w:t>
-            </w:r>
-          </w:p>
-          <w:p>
-            <w:pPr>
-              <w:spacing w:before="70" w:after="70"/>
-            </w:pPr>
-            <w:r>
-              <w:rPr>
-                <w:rFonts w:ascii="Segoe UI Emoji" w:eastAsia="Segoe UI Emoji" w:hAnsi="Segoe UI Emoji" w:cs="Segoe UI Emoji"/>
-                <w:sz w:val="19"/>
-                <w:szCs w:val="19"/>
-              </w:rPr>
-              <w:t>🐧</w:t>
-            </w:r>
-            <w:r>
-              <w:rPr>
-                <w:rFonts w:ascii="Segoe UI Emoji" w:eastAsia="Segoe UI Emoji" w:hAnsi="Segoe UI Emoji" w:cs="Segoe UI Emoji"/>
-                <w:sz w:val="19"/>
-                <w:szCs w:val="19"/>
-              </w:rPr>
-              <w:t xml:space="preserve">  </w:t>
-            </w:r>
-            <w:r>
-              <w:rPr>
-                <w:rFonts w:ascii="Calibri" w:eastAsia="Calibri" w:hAnsi="Calibri" w:cs="Calibri"/>
-                <w:color w:val="FFFFFF"/>
-                <w:sz w:val="19"/>
-                <w:szCs w:val="19"/>
-              </w:rPr>
-              <w:t>Kali Linux</w:t>
-            </w:r>
-          </w:p>
-          <w:p>
-            <w:pPr>
-              <w:spacing w:before="70" w:after="70"/>
-            </w:pPr>
-            <w:r>
-              <w:rPr>
-                <w:rFonts w:ascii="Segoe UI Emoji" w:eastAsia="Segoe UI Emoji" w:hAnsi="Segoe UI Emoji" w:cs="Segoe UI Emoji"/>
-                <w:sz w:val="19"/>
-                <w:szCs w:val="19"/>
-              </w:rPr>
-              <w:t>🌐</w:t>
-            </w:r>
-            <w:r>
-              <w:rPr>
-                <w:rFonts w:ascii="Segoe UI Emoji" w:eastAsia="Segoe UI Emoji" w:hAnsi="Segoe UI Emoji" w:cs="Segoe UI Emoji"/>
-                <w:sz w:val="19"/>
-                <w:szCs w:val="19"/>
-              </w:rPr>
-              <w:t xml:space="preserve">  </w:t>
+              <w:t xml:space="preserve">🌐  </w:t>
             </w:r>
             <w:r>
               <w:rPr>
@@ -671,14 +578,7 @@
                 <w:rFonts w:ascii="Calibri" w:eastAsia="Calibri" w:hAnsi="Calibri" w:cs="Calibri"/>
                 <w:color w:val="2C3E50"/>
               </w:rPr>
-              <w:t>Motivated and detail-oriented Software Engineering student with a strong foundation in programming, networking, and problem-solving. Actively seeking an internship opportunity to apply academic knowledge in real-world environments, contribute to innovative</w:t>
-            </w:r>
-            <w:r>
-              <w:rPr>
-                <w:rFonts w:ascii="Calibri" w:eastAsia="Calibri" w:hAnsi="Calibri" w:cs="Calibri"/>
-                <w:color w:val="2C3E50"/>
-              </w:rPr>
-              <w:t xml:space="preserve"> software solutions, and gain meaningful hands-on industry experience.</w:t>
+              <w:t>Motivated and detail-oriented Software Engineering student with a strong foundation in programming, networking, and problem-solving. Actively seeking an internship opportunity to apply academic knowledge in real-world environments, contribute to innovative software solutions, and gain meaningful hands-on industry experience.</w:t>
             </w:r>
           </w:p>
           <w:p>
@@ -736,12 +636,6 @@
               <w:gridCol w:w="2283"/>
             </w:tblGrid>
             <w:tr>
-              <w:tblPrEx>
-                <w:tblCellMar>
-                  <w:top w:w="0" w:type="dxa"/>
-                  <w:bottom w:w="0" w:type="dxa"/>
-                </w:tblCellMar>
-              </w:tblPrEx>
               <w:tc>
                 <w:tcPr>
                   <w:tcW w:w="0" w:type="auto"/>
@@ -891,12 +785,6 @@
               <w:gridCol w:w="2013"/>
             </w:tblGrid>
             <w:tr>
-              <w:tblPrEx>
-                <w:tblCellMar>
-                  <w:top w:w="0" w:type="dxa"/>
-                  <w:bottom w:w="0" w:type="dxa"/>
-                </w:tblCellMar>
-              </w:tblPrEx>
               <w:tc>
                 <w:tcPr>
                   <w:tcW w:w="0" w:type="auto"/>
@@ -1006,12 +894,6 @@
               <w:gridCol w:w="1594"/>
             </w:tblGrid>
             <w:tr>
-              <w:tblPrEx>
-                <w:tblCellMar>
-                  <w:top w:w="0" w:type="dxa"/>
-                  <w:bottom w:w="0" w:type="dxa"/>
-                </w:tblCellMar>
-              </w:tblPrEx>
               <w:tc>
                 <w:tcPr>
                   <w:tcW w:w="0" w:type="auto"/>
@@ -1119,12 +1001,6 @@
               <w:gridCol w:w="2200"/>
             </w:tblGrid>
             <w:tr>
-              <w:tblPrEx>
-                <w:tblCellMar>
-                  <w:top w:w="0" w:type="dxa"/>
-                  <w:bottom w:w="0" w:type="dxa"/>
-                </w:tblCellMar>
-              </w:tblPrEx>
               <w:tc>
                 <w:tcPr>
                   <w:tcW w:w="0" w:type="auto"/>
@@ -1247,19 +1123,7 @@
                 <w:sz w:val="22"/>
                 <w:szCs w:val="22"/>
               </w:rPr>
-              <w:t>RELEVANT COURSEW</w:t>
-            </w:r>
-            <w:r>
-              <w:rPr>
-                <w:rFonts w:ascii="Calibri" w:eastAsia="Calibri" w:hAnsi="Calibri" w:cs="Calibri"/>
-                <w:b/>
-                <w:bCs/>
-                <w:color w:val="1B2A4A"/>
-                <w:spacing w:val="80"/>
-                <w:sz w:val="22"/>
-                <w:szCs w:val="22"/>
-              </w:rPr>
-              <w:t>ORK</w:t>
+              <w:t>RELEVANT COURSEWORK</w:t>
             </w:r>
           </w:p>
           <w:p>
@@ -1286,12 +1150,6 @@
               <w:gridCol w:w="2218"/>
             </w:tblGrid>
             <w:tr>
-              <w:tblPrEx>
-                <w:tblCellMar>
-                  <w:top w:w="0" w:type="dxa"/>
-                  <w:bottom w:w="0" w:type="dxa"/>
-                </w:tblCellMar>
-              </w:tblPrEx>
               <w:tc>
                 <w:tcPr>
                   <w:tcW w:w="0" w:type="auto"/>
@@ -1392,12 +1250,6 @@
               <w:gridCol w:w="2254"/>
             </w:tblGrid>
             <w:tr>
-              <w:tblPrEx>
-                <w:tblCellMar>
-                  <w:top w:w="0" w:type="dxa"/>
-                  <w:bottom w:w="0" w:type="dxa"/>
-                </w:tblCellMar>
-              </w:tblPrEx>
               <w:tc>
                 <w:tcPr>
                   <w:tcW w:w="0" w:type="auto"/>
@@ -1494,7 +1346,7 @@
 </file>
 
 <file path=word/numbering.xml><?xml version="1.0" encoding="utf-8"?>
-<w:numbering xmlns:wpc="http://schemas.microsoft.com/office/word/2010/wordprocessingCanvas" xmlns:cx="http://schemas.microsoft.com/office/drawing/2014/chartex" xmlns:cx1="http://schemas.microsoft.com/office/drawing/2015/9/8/chartex" xmlns:mc="http://schemas.openxmlformats.org/markup-compatibility/2006" xmlns:o="urn:schemas-microsoft-com:office:office" xmlns:r="http://schemas.openxmlformats.org/officeDocument/2006/relationships" xmlns:m="http://schemas.openxmlformats.org/officeDocument/2006/math" xmlns:v="urn:schemas-microsoft-com:vml" xmlns:wp14="http://schemas.microsoft.com/office/word/2010/wordprocessingDrawing" xmlns:wp="http://schemas.openxmlformats.org/drawingml/2006/wordprocessingDrawing" xmlns:w10="urn:schemas-microsoft-com:office:word" xmlns:w="http://schemas.openxmlformats.org/wordprocessingml/2006/main" xmlns:w14="http://schemas.microsoft.com/office/word/2010/wordml" xmlns:w15="http://schemas.microsoft.com/office/word/2012/wordml" xmlns:w16se="http://schemas.microsoft.com/office/word/2015/wordml/symex" xmlns:wpg="http://schemas.microsoft.com/office/word/2010/wordprocessingGroup" xmlns:wpi="http://schemas.microsoft.com/office/word/2010/wordprocessingInk" xmlns:wne="http://schemas.microsoft.com/office/word/2006/wordml" xmlns:wps="http://schemas.microsoft.com/office/word/2010/wordprocessingShape" mc:Ignorable="w14 w15 w16se wp14">
+<w:numbering xmlns:wpc="http://schemas.microsoft.com/office/word/2010/wordprocessingCanvas" xmlns:cx="http://schemas.microsoft.com/office/drawing/2014/chartex" xmlns:cx1="http://schemas.microsoft.com/office/drawing/2015/9/8/chartex" xmlns:cx2="http://schemas.microsoft.com/office/drawing/2015/10/21/chartex" xmlns:cx3="http://schemas.microsoft.com/office/drawing/2016/5/9/chartex" xmlns:cx4="http://schemas.microsoft.com/office/drawing/2016/5/10/chartex" xmlns:cx5="http://schemas.microsoft.com/office/drawing/2016/5/11/chartex" xmlns:cx6="http://schemas.microsoft.com/office/drawing/2016/5/12/chartex" xmlns:cx7="http://schemas.microsoft.com/office/drawing/2016/5/13/chartex" xmlns:cx8="http://schemas.microsoft.com/office/drawing/2016/5/14/chartex" xmlns:mc="http://schemas.openxmlformats.org/markup-compatibility/2006" xmlns:aink="http://schemas.microsoft.com/office/drawing/2016/ink" xmlns:am3d="http://schemas.microsoft.com/office/drawing/2017/model3d" xmlns:o="urn:schemas-microsoft-com:office:office" xmlns:r="http://schemas.openxmlformats.org/officeDocument/2006/relationships" xmlns:m="http://schemas.openxmlformats.org/officeDocument/2006/math" xmlns:v="urn:schemas-microsoft-com:vml" xmlns:wp14="http://schemas.microsoft.com/office/word/2010/wordprocessingDrawing" xmlns:wp="http://schemas.openxmlformats.org/drawingml/2006/wordprocessingDrawing" xmlns:w10="urn:schemas-microsoft-com:office:word" xmlns:w="http://schemas.openxmlformats.org/wordprocessingml/2006/main" xmlns:w14="http://schemas.microsoft.com/office/word/2010/wordml" xmlns:w15="http://schemas.microsoft.com/office/word/2012/wordml" xmlns:w16cex="http://schemas.microsoft.com/office/word/2018/wordml/cex" xmlns:w16cid="http://schemas.microsoft.com/office/word/2016/wordml/cid" xmlns:w16="http://schemas.microsoft.com/office/word/2018/wordml" xmlns:w16sdtdh="http://schemas.microsoft.com/office/word/2020/wordml/sdtdatahash" xmlns:w16se="http://schemas.microsoft.com/office/word/2015/wordml/symex" xmlns:wpg="http://schemas.microsoft.com/office/word/2010/wordprocessingGroup" xmlns:wpi="http://schemas.microsoft.com/office/word/2010/wordprocessingInk" xmlns:wne="http://schemas.microsoft.com/office/word/2006/wordml" xmlns:wps="http://schemas.microsoft.com/office/word/2010/wordprocessingShape" mc:Ignorable="w14 w15 w16se w16cid w16 w16cex w16sdtdh wp14">
   <w:abstractNum w:abstractNumId="0" w15:restartNumberingAfterBreak="0">
     <w:nsid w:val="05250D5F"/>
     <w:multiLevelType w:val="hybridMultilevel"/>
@@ -1645,7 +1497,7 @@
 </file>
 
 <file path=word/styles.xml><?xml version="1.0" encoding="utf-8"?>
-<w:styles xmlns:mc="http://schemas.openxmlformats.org/markup-compatibility/2006" xmlns:r="http://schemas.openxmlformats.org/officeDocument/2006/relationships" xmlns:w="http://schemas.openxmlformats.org/wordprocessingml/2006/main" xmlns:w14="http://schemas.microsoft.com/office/word/2010/wordml" xmlns:w15="http://schemas.microsoft.com/office/word/2012/wordml" xmlns:w16se="http://schemas.microsoft.com/office/word/2015/wordml/symex" mc:Ignorable="w14 w15 w16se">
+<w:styles xmlns:mc="http://schemas.openxmlformats.org/markup-compatibility/2006" xmlns:r="http://schemas.openxmlformats.org/officeDocument/2006/relationships" xmlns:w="http://schemas.openxmlformats.org/wordprocessingml/2006/main" xmlns:w14="http://schemas.microsoft.com/office/word/2010/wordml" xmlns:w15="http://schemas.microsoft.com/office/word/2012/wordml" xmlns:w16cex="http://schemas.microsoft.com/office/word/2018/wordml/cex" xmlns:w16cid="http://schemas.microsoft.com/office/word/2016/wordml/cid" xmlns:w16="http://schemas.microsoft.com/office/word/2018/wordml" xmlns:w16sdtdh="http://schemas.microsoft.com/office/word/2020/wordml/sdtdatahash" xmlns:w16se="http://schemas.microsoft.com/office/word/2015/wordml/symex" mc:Ignorable="w14 w15 w16se w16cid w16 w16cex w16sdtdh">
   <w:docDefaults>
     <w:rPrDefault>
       <w:rPr>
@@ -1655,7 +1507,7 @@
     </w:rPrDefault>
     <w:pPrDefault/>
   </w:docDefaults>
-  <w:latentStyles w:defLockedState="0" w:defUIPriority="99" w:defSemiHidden="0" w:defUnhideWhenUsed="0" w:defQFormat="0" w:count="371">
+  <w:latentStyles w:defLockedState="0" w:defUIPriority="99" w:defSemiHidden="0" w:defUnhideWhenUsed="0" w:defQFormat="0" w:count="376">
     <w:lsdException w:name="Normal" w:uiPriority="0" w:qFormat="1"/>
     <w:lsdException w:name="heading 1" w:uiPriority="9" w:qFormat="1"/>
     <w:lsdException w:name="heading 2" w:semiHidden="1" w:uiPriority="9" w:unhideWhenUsed="1" w:qFormat="1"/>
@@ -1761,7 +1613,6 @@
     <w:lsdException w:name="HTML Sample" w:semiHidden="1" w:unhideWhenUsed="1"/>
     <w:lsdException w:name="HTML Typewriter" w:semiHidden="1" w:unhideWhenUsed="1"/>
     <w:lsdException w:name="HTML Variable" w:semiHidden="1" w:unhideWhenUsed="1"/>
-    <w:lsdException w:name="Normal Table" w:semiHidden="1" w:unhideWhenUsed="1"/>
     <w:lsdException w:name="annotation subject" w:semiHidden="1" w:unhideWhenUsed="1"/>
     <w:lsdException w:name="No List" w:semiHidden="1" w:unhideWhenUsed="1"/>
     <w:lsdException w:name="Outline List 1" w:semiHidden="1" w:unhideWhenUsed="1"/>
@@ -1804,11 +1655,8 @@
     <w:lsdException w:name="Table Contemporary" w:semiHidden="1" w:unhideWhenUsed="1"/>
     <w:lsdException w:name="Table Elegant" w:semiHidden="1" w:unhideWhenUsed="1"/>
     <w:lsdException w:name="Table Professional" w:semiHidden="1" w:unhideWhenUsed="1"/>
-    <w:lsdException w:name="Table Subtle 1" w:semiHidden="1" w:unhideWhenUsed="1"/>
     <w:lsdException w:name="Table Subtle 2" w:semiHidden="1" w:unhideWhenUsed="1"/>
     <w:lsdException w:name="Table Web 1" w:semiHidden="1" w:unhideWhenUsed="1"/>
-    <w:lsdException w:name="Table Web 2" w:semiHidden="1" w:unhideWhenUsed="1"/>
-    <w:lsdException w:name="Table Web 3" w:semiHidden="1" w:unhideWhenUsed="1"/>
     <w:lsdException w:name="Balloon Text" w:semiHidden="1" w:unhideWhenUsed="1"/>
     <w:lsdException w:name="Table Grid" w:uiPriority="39"/>
     <w:lsdException w:name="Table Theme" w:semiHidden="1" w:unhideWhenUsed="1"/>
@@ -2027,6 +1875,11 @@
     <w:lsdException w:name="List Table 5 Dark Accent 6" w:uiPriority="50"/>
     <w:lsdException w:name="List Table 6 Colorful Accent 6" w:uiPriority="51"/>
     <w:lsdException w:name="List Table 7 Colorful Accent 6" w:uiPriority="52"/>
+    <w:lsdException w:name="Mention" w:semiHidden="1" w:unhideWhenUsed="1"/>
+    <w:lsdException w:name="Smart Hyperlink" w:semiHidden="1" w:unhideWhenUsed="1"/>
+    <w:lsdException w:name="Hashtag" w:semiHidden="1" w:unhideWhenUsed="1"/>
+    <w:lsdException w:name="Unresolved Mention" w:semiHidden="1" w:unhideWhenUsed="1"/>
+    <w:lsdException w:name="Smart Link" w:semiHidden="1" w:unhideWhenUsed="1"/>
   </w:latentStyles>
   <w:style w:type="paragraph" w:default="1" w:styleId="Normal">
     <w:name w:val="Normal"/>

</xml_diff>